<commit_message>
Correct spec 039 framing, switch report to dark theme, add global data-sources list
- Module 039 (Risk & Scenario Modeling) was reading as blocked/waiting on
  a partner; the feature (risk indicators, scoring dashboard, cascading-risk
  engine) is fully live in production today. Only an INFORM-methodology
  documentation cross-reference is pending UNDP's reply — reworded in both
  the HTML and DOCX to make that distinction unambiguous.
- HTML report switched from light to dark theme (print media query keeps
  the original light palette for physical printing).
- Added a section distinguishing the platform's global/shared data sources
  (GDACS, USGS, NASA FIRMS, etc., provided to every country at no extra
  integration effort) from each country's own locally-added sources
  (e.g. Turkey's AFAD/Kandilli feeds).

Co-Authored-By: Claude Sonnet 5 <noreply@anthropic.com>
</commit_message>
<xml_diff>
--- a/docs/plans/PROJECT_STATUS_REPORT.docx
+++ b/docs/plans/PROJECT_STATUS_REPORT.docx
@@ -1425,6 +1425,705 @@
       </w:pPr>
       <w:r>
         <w:t xml:space="preserve">Every step above — every login, edit, approval, and dispatch — is written to a tamper-evident audit log (a cryptographic hash chain, the same integrity idea used in blockchains), so the full history of any alert can be reconstructed and verified later.</w:t>
+      </w:r>
+    </w:p>
+    <w:p>
+      <w:pPr>
+        <w:pStyle w:val="Heading3"/>
+        <w:spacing w:after="100" w:before="240"/>
+      </w:pPr>
+      <w:r>
+        <w:t xml:space="preserve">2.5 — Global sources vs. each country’s own local sources</w:t>
+      </w:r>
+    </w:p>
+    <w:p>
+      <w:pPr>
+        <w:spacing w:after="160"/>
+      </w:pPr>
+      <w:r>
+        <w:t xml:space="preserve">It’s worth being explicit about which data sources the platform provides out of the box, for every country, at no extra integration effort — versus sources a country adds itself for its own local needs.</w:t>
+      </w:r>
+    </w:p>
+    <w:tbl>
+      <w:tblPr>
+        <w:tblW w:type="dxa" w:w="10080"/>
+        <w:tblBorders>
+          <w:top w:val="single" w:color="auto" w:sz="4"/>
+          <w:left w:val="single" w:color="auto" w:sz="4"/>
+          <w:bottom w:val="single" w:color="auto" w:sz="4"/>
+          <w:right w:val="single" w:color="auto" w:sz="4"/>
+          <w:insideH w:val="single" w:color="auto" w:sz="4"/>
+          <w:insideV w:val="single" w:color="auto" w:sz="4"/>
+        </w:tblBorders>
+      </w:tblPr>
+      <w:tblGrid>
+        <w:gridCol w:w="4680"/>
+        <w:gridCol w:w="4680"/>
+      </w:tblGrid>
+      <w:tr>
+        <w:trPr>
+          <w:tblHeader/>
+        </w:trPr>
+        <w:tc>
+          <w:tcPr>
+            <w:tcW w:type="dxa" w:w="4680"/>
+            <w:tcBorders>
+              <w:top w:val="single" w:color="DDE3EC" w:sz="4"/>
+              <w:left w:val="single" w:color="DDE3EC" w:sz="4"/>
+              <w:bottom w:val="single" w:color="DDE3EC" w:sz="4"/>
+              <w:right w:val="single" w:color="DDE3EC" w:sz="4"/>
+            </w:tcBorders>
+            <w:shd w:fill="F8FAFC" w:val="clear"/>
+            <w:tcMar>
+              <w:top w:type="dxa" w:w="60"/>
+              <w:left w:type="dxa" w:w="100"/>
+              <w:bottom w:type="dxa" w:w="60"/>
+              <w:right w:type="dxa" w:w="100"/>
+            </w:tcMar>
+          </w:tcPr>
+          <w:p>
+            <w:r>
+              <w:rPr>
+                <w:b/>
+                <w:bCs/>
+                <w:sz w:val="16"/>
+                <w:szCs w:val="16"/>
+              </w:rPr>
+              <w:t xml:space="preserve">Global Source (provided to every country)</w:t>
+            </w:r>
+          </w:p>
+        </w:tc>
+        <w:tc>
+          <w:tcPr>
+            <w:tcW w:type="dxa" w:w="4680"/>
+            <w:tcBorders>
+              <w:top w:val="single" w:color="DDE3EC" w:sz="4"/>
+              <w:left w:val="single" w:color="DDE3EC" w:sz="4"/>
+              <w:bottom w:val="single" w:color="DDE3EC" w:sz="4"/>
+              <w:right w:val="single" w:color="DDE3EC" w:sz="4"/>
+            </w:tcBorders>
+            <w:shd w:fill="F8FAFC" w:val="clear"/>
+            <w:tcMar>
+              <w:top w:type="dxa" w:w="60"/>
+              <w:left w:type="dxa" w:w="100"/>
+              <w:bottom w:type="dxa" w:w="60"/>
+              <w:right w:type="dxa" w:w="100"/>
+            </w:tcMar>
+          </w:tcPr>
+          <w:p>
+            <w:r>
+              <w:rPr>
+                <w:b/>
+                <w:bCs/>
+                <w:sz w:val="16"/>
+                <w:szCs w:val="16"/>
+              </w:rPr>
+              <w:t xml:space="preserve">Hazard / Data Type</w:t>
+            </w:r>
+          </w:p>
+        </w:tc>
+      </w:tr>
+      <w:tr>
+        <w:tc>
+          <w:tcPr>
+            <w:tcW w:type="dxa" w:w="4680"/>
+            <w:tcBorders>
+              <w:top w:val="single" w:color="DDE3EC" w:sz="4"/>
+              <w:left w:val="single" w:color="DDE3EC" w:sz="4"/>
+              <w:bottom w:val="single" w:color="DDE3EC" w:sz="4"/>
+              <w:right w:val="single" w:color="DDE3EC" w:sz="4"/>
+            </w:tcBorders>
+            <w:tcMar>
+              <w:top w:type="dxa" w:w="60"/>
+              <w:left w:type="dxa" w:w="100"/>
+              <w:bottom w:type="dxa" w:w="60"/>
+              <w:right w:type="dxa" w:w="100"/>
+            </w:tcMar>
+          </w:tcPr>
+          <w:p>
+            <w:r>
+              <w:rPr>
+                <w:b/>
+                <w:bCs/>
+              </w:rPr>
+              <w:t xml:space="preserve">USGS, EMSC, GEOFON</w:t>
+            </w:r>
+          </w:p>
+        </w:tc>
+        <w:tc>
+          <w:tcPr>
+            <w:tcW w:type="dxa" w:w="4680"/>
+            <w:tcBorders>
+              <w:top w:val="single" w:color="DDE3EC" w:sz="4"/>
+              <w:left w:val="single" w:color="DDE3EC" w:sz="4"/>
+              <w:bottom w:val="single" w:color="DDE3EC" w:sz="4"/>
+              <w:right w:val="single" w:color="DDE3EC" w:sz="4"/>
+            </w:tcBorders>
+            <w:tcMar>
+              <w:top w:type="dxa" w:w="60"/>
+              <w:left w:type="dxa" w:w="100"/>
+              <w:bottom w:type="dxa" w:w="60"/>
+              <w:right w:type="dxa" w:w="100"/>
+            </w:tcMar>
+          </w:tcPr>
+          <w:p>
+            <w:r>
+              <w:rPr>
+                <w:sz w:val="18"/>
+                <w:szCs w:val="18"/>
+              </w:rPr>
+              <w:t xml:space="preserve">Earthquakes (worldwide coverage)</w:t>
+            </w:r>
+          </w:p>
+        </w:tc>
+      </w:tr>
+      <w:tr>
+        <w:tc>
+          <w:tcPr>
+            <w:tcW w:type="dxa" w:w="4680"/>
+            <w:tcBorders>
+              <w:top w:val="single" w:color="DDE3EC" w:sz="4"/>
+              <w:left w:val="single" w:color="DDE3EC" w:sz="4"/>
+              <w:bottom w:val="single" w:color="DDE3EC" w:sz="4"/>
+              <w:right w:val="single" w:color="DDE3EC" w:sz="4"/>
+            </w:tcBorders>
+            <w:tcMar>
+              <w:top w:type="dxa" w:w="60"/>
+              <w:left w:type="dxa" w:w="100"/>
+              <w:bottom w:type="dxa" w:w="60"/>
+              <w:right w:type="dxa" w:w="100"/>
+            </w:tcMar>
+          </w:tcPr>
+          <w:p>
+            <w:r>
+              <w:rPr>
+                <w:b/>
+                <w:bCs/>
+              </w:rPr>
+              <w:t xml:space="preserve">GDACS</w:t>
+            </w:r>
+          </w:p>
+        </w:tc>
+        <w:tc>
+          <w:tcPr>
+            <w:tcW w:type="dxa" w:w="4680"/>
+            <w:tcBorders>
+              <w:top w:val="single" w:color="DDE3EC" w:sz="4"/>
+              <w:left w:val="single" w:color="DDE3EC" w:sz="4"/>
+              <w:bottom w:val="single" w:color="DDE3EC" w:sz="4"/>
+              <w:right w:val="single" w:color="DDE3EC" w:sz="4"/>
+            </w:tcBorders>
+            <w:tcMar>
+              <w:top w:type="dxa" w:w="60"/>
+              <w:left w:type="dxa" w:w="100"/>
+              <w:bottom w:type="dxa" w:w="60"/>
+              <w:right w:type="dxa" w:w="100"/>
+            </w:tcMar>
+          </w:tcPr>
+          <w:p>
+            <w:r>
+              <w:rPr>
+                <w:sz w:val="18"/>
+                <w:szCs w:val="18"/>
+              </w:rPr>
+              <w:t xml:space="preserve">Multi-hazard (earthquake, flood, tropical cyclone, drought, volcano)</w:t>
+            </w:r>
+          </w:p>
+        </w:tc>
+      </w:tr>
+      <w:tr>
+        <w:tc>
+          <w:tcPr>
+            <w:tcW w:type="dxa" w:w="4680"/>
+            <w:tcBorders>
+              <w:top w:val="single" w:color="DDE3EC" w:sz="4"/>
+              <w:left w:val="single" w:color="DDE3EC" w:sz="4"/>
+              <w:bottom w:val="single" w:color="DDE3EC" w:sz="4"/>
+              <w:right w:val="single" w:color="DDE3EC" w:sz="4"/>
+            </w:tcBorders>
+            <w:tcMar>
+              <w:top w:type="dxa" w:w="60"/>
+              <w:left w:type="dxa" w:w="100"/>
+              <w:bottom w:type="dxa" w:w="60"/>
+              <w:right w:type="dxa" w:w="100"/>
+            </w:tcMar>
+          </w:tcPr>
+          <w:p>
+            <w:r>
+              <w:rPr>
+                <w:b/>
+                <w:bCs/>
+              </w:rPr>
+              <w:t xml:space="preserve">NASA FIRMS</w:t>
+            </w:r>
+          </w:p>
+        </w:tc>
+        <w:tc>
+          <w:tcPr>
+            <w:tcW w:type="dxa" w:w="4680"/>
+            <w:tcBorders>
+              <w:top w:val="single" w:color="DDE3EC" w:sz="4"/>
+              <w:left w:val="single" w:color="DDE3EC" w:sz="4"/>
+              <w:bottom w:val="single" w:color="DDE3EC" w:sz="4"/>
+              <w:right w:val="single" w:color="DDE3EC" w:sz="4"/>
+            </w:tcBorders>
+            <w:tcMar>
+              <w:top w:type="dxa" w:w="60"/>
+              <w:left w:type="dxa" w:w="100"/>
+              <w:bottom w:type="dxa" w:w="60"/>
+              <w:right w:type="dxa" w:w="100"/>
+            </w:tcMar>
+          </w:tcPr>
+          <w:p>
+            <w:r>
+              <w:rPr>
+                <w:sz w:val="18"/>
+                <w:szCs w:val="18"/>
+              </w:rPr>
+              <w:t xml:space="preserve">Wildfire detection &amp; fire intensity (satellite)</w:t>
+            </w:r>
+          </w:p>
+        </w:tc>
+      </w:tr>
+      <w:tr>
+        <w:tc>
+          <w:tcPr>
+            <w:tcW w:type="dxa" w:w="4680"/>
+            <w:tcBorders>
+              <w:top w:val="single" w:color="DDE3EC" w:sz="4"/>
+              <w:left w:val="single" w:color="DDE3EC" w:sz="4"/>
+              <w:bottom w:val="single" w:color="DDE3EC" w:sz="4"/>
+              <w:right w:val="single" w:color="DDE3EC" w:sz="4"/>
+            </w:tcBorders>
+            <w:tcMar>
+              <w:top w:type="dxa" w:w="60"/>
+              <w:left w:type="dxa" w:w="100"/>
+              <w:bottom w:type="dxa" w:w="60"/>
+              <w:right w:type="dxa" w:w="100"/>
+            </w:tcMar>
+          </w:tcPr>
+          <w:p>
+            <w:r>
+              <w:rPr>
+                <w:b/>
+                <w:bCs/>
+              </w:rPr>
+              <w:t xml:space="preserve">WHO</w:t>
+            </w:r>
+          </w:p>
+        </w:tc>
+        <w:tc>
+          <w:tcPr>
+            <w:tcW w:type="dxa" w:w="4680"/>
+            <w:tcBorders>
+              <w:top w:val="single" w:color="DDE3EC" w:sz="4"/>
+              <w:left w:val="single" w:color="DDE3EC" w:sz="4"/>
+              <w:bottom w:val="single" w:color="DDE3EC" w:sz="4"/>
+              <w:right w:val="single" w:color="DDE3EC" w:sz="4"/>
+            </w:tcBorders>
+            <w:tcMar>
+              <w:top w:type="dxa" w:w="60"/>
+              <w:left w:type="dxa" w:w="100"/>
+              <w:bottom w:type="dxa" w:w="60"/>
+              <w:right w:type="dxa" w:w="100"/>
+            </w:tcMar>
+          </w:tcPr>
+          <w:p>
+            <w:r>
+              <w:rPr>
+                <w:sz w:val="18"/>
+                <w:szCs w:val="18"/>
+              </w:rPr>
+              <w:t xml:space="preserve">Epidemic / disease-outbreak alerts</w:t>
+            </w:r>
+          </w:p>
+        </w:tc>
+      </w:tr>
+      <w:tr>
+        <w:tc>
+          <w:tcPr>
+            <w:tcW w:type="dxa" w:w="4680"/>
+            <w:tcBorders>
+              <w:top w:val="single" w:color="DDE3EC" w:sz="4"/>
+              <w:left w:val="single" w:color="DDE3EC" w:sz="4"/>
+              <w:bottom w:val="single" w:color="DDE3EC" w:sz="4"/>
+              <w:right w:val="single" w:color="DDE3EC" w:sz="4"/>
+            </w:tcBorders>
+            <w:tcMar>
+              <w:top w:type="dxa" w:w="60"/>
+              <w:left w:type="dxa" w:w="100"/>
+              <w:bottom w:type="dxa" w:w="60"/>
+              <w:right w:type="dxa" w:w="100"/>
+            </w:tcMar>
+          </w:tcPr>
+          <w:p>
+            <w:r>
+              <w:rPr>
+                <w:b/>
+                <w:bCs/>
+              </w:rPr>
+              <w:t xml:space="preserve">PTWC (Pacific Tsunami Warning Center)</w:t>
+            </w:r>
+          </w:p>
+        </w:tc>
+        <w:tc>
+          <w:tcPr>
+            <w:tcW w:type="dxa" w:w="4680"/>
+            <w:tcBorders>
+              <w:top w:val="single" w:color="DDE3EC" w:sz="4"/>
+              <w:left w:val="single" w:color="DDE3EC" w:sz="4"/>
+              <w:bottom w:val="single" w:color="DDE3EC" w:sz="4"/>
+              <w:right w:val="single" w:color="DDE3EC" w:sz="4"/>
+            </w:tcBorders>
+            <w:tcMar>
+              <w:top w:type="dxa" w:w="60"/>
+              <w:left w:type="dxa" w:w="100"/>
+              <w:bottom w:type="dxa" w:w="60"/>
+              <w:right w:type="dxa" w:w="100"/>
+            </w:tcMar>
+          </w:tcPr>
+          <w:p>
+            <w:r>
+              <w:rPr>
+                <w:sz w:val="18"/>
+                <w:szCs w:val="18"/>
+              </w:rPr>
+              <w:t xml:space="preserve">Tsunami</w:t>
+            </w:r>
+          </w:p>
+        </w:tc>
+      </w:tr>
+      <w:tr>
+        <w:tc>
+          <w:tcPr>
+            <w:tcW w:type="dxa" w:w="4680"/>
+            <w:tcBorders>
+              <w:top w:val="single" w:color="DDE3EC" w:sz="4"/>
+              <w:left w:val="single" w:color="DDE3EC" w:sz="4"/>
+              <w:bottom w:val="single" w:color="DDE3EC" w:sz="4"/>
+              <w:right w:val="single" w:color="DDE3EC" w:sz="4"/>
+            </w:tcBorders>
+            <w:tcMar>
+              <w:top w:type="dxa" w:w="60"/>
+              <w:left w:type="dxa" w:w="100"/>
+              <w:bottom w:type="dxa" w:w="60"/>
+              <w:right w:type="dxa" w:w="100"/>
+            </w:tcMar>
+          </w:tcPr>
+          <w:p>
+            <w:r>
+              <w:rPr>
+                <w:b/>
+                <w:bCs/>
+              </w:rPr>
+              <w:t xml:space="preserve">FEWS NET</w:t>
+            </w:r>
+          </w:p>
+        </w:tc>
+        <w:tc>
+          <w:tcPr>
+            <w:tcW w:type="dxa" w:w="4680"/>
+            <w:tcBorders>
+              <w:top w:val="single" w:color="DDE3EC" w:sz="4"/>
+              <w:left w:val="single" w:color="DDE3EC" w:sz="4"/>
+              <w:bottom w:val="single" w:color="DDE3EC" w:sz="4"/>
+              <w:right w:val="single" w:color="DDE3EC" w:sz="4"/>
+            </w:tcBorders>
+            <w:tcMar>
+              <w:top w:type="dxa" w:w="60"/>
+              <w:left w:type="dxa" w:w="100"/>
+              <w:bottom w:type="dxa" w:w="60"/>
+              <w:right w:type="dxa" w:w="100"/>
+            </w:tcMar>
+          </w:tcPr>
+          <w:p>
+            <w:r>
+              <w:rPr>
+                <w:sz w:val="18"/>
+                <w:szCs w:val="18"/>
+              </w:rPr>
+              <w:t xml:space="preserve">Food security / famine early warning</w:t>
+            </w:r>
+          </w:p>
+        </w:tc>
+      </w:tr>
+      <w:tr>
+        <w:tc>
+          <w:tcPr>
+            <w:tcW w:type="dxa" w:w="4680"/>
+            <w:tcBorders>
+              <w:top w:val="single" w:color="DDE3EC" w:sz="4"/>
+              <w:left w:val="single" w:color="DDE3EC" w:sz="4"/>
+              <w:bottom w:val="single" w:color="DDE3EC" w:sz="4"/>
+              <w:right w:val="single" w:color="DDE3EC" w:sz="4"/>
+            </w:tcBorders>
+            <w:tcMar>
+              <w:top w:type="dxa" w:w="60"/>
+              <w:left w:type="dxa" w:w="100"/>
+              <w:bottom w:type="dxa" w:w="60"/>
+              <w:right w:type="dxa" w:w="100"/>
+            </w:tcMar>
+          </w:tcPr>
+          <w:p>
+            <w:r>
+              <w:rPr>
+                <w:b/>
+                <w:bCs/>
+              </w:rPr>
+              <w:t xml:space="preserve">WorldPop, Meta/HDX, GHSL</w:t>
+            </w:r>
+          </w:p>
+        </w:tc>
+        <w:tc>
+          <w:tcPr>
+            <w:tcW w:type="dxa" w:w="4680"/>
+            <w:tcBorders>
+              <w:top w:val="single" w:color="DDE3EC" w:sz="4"/>
+              <w:left w:val="single" w:color="DDE3EC" w:sz="4"/>
+              <w:bottom w:val="single" w:color="DDE3EC" w:sz="4"/>
+              <w:right w:val="single" w:color="DDE3EC" w:sz="4"/>
+            </w:tcBorders>
+            <w:tcMar>
+              <w:top w:type="dxa" w:w="60"/>
+              <w:left w:type="dxa" w:w="100"/>
+              <w:bottom w:type="dxa" w:w="60"/>
+              <w:right w:type="dxa" w:w="100"/>
+            </w:tcMar>
+          </w:tcPr>
+          <w:p>
+            <w:r>
+              <w:rPr>
+                <w:sz w:val="18"/>
+                <w:szCs w:val="18"/>
+              </w:rPr>
+              <w:t xml:space="preserve">Population density (three independent global datasets)</w:t>
+            </w:r>
+          </w:p>
+        </w:tc>
+      </w:tr>
+      <w:tr>
+        <w:tc>
+          <w:tcPr>
+            <w:tcW w:type="dxa" w:w="4680"/>
+            <w:tcBorders>
+              <w:top w:val="single" w:color="DDE3EC" w:sz="4"/>
+              <w:left w:val="single" w:color="DDE3EC" w:sz="4"/>
+              <w:bottom w:val="single" w:color="DDE3EC" w:sz="4"/>
+              <w:right w:val="single" w:color="DDE3EC" w:sz="4"/>
+            </w:tcBorders>
+            <w:tcMar>
+              <w:top w:type="dxa" w:w="60"/>
+              <w:left w:type="dxa" w:w="100"/>
+              <w:bottom w:type="dxa" w:w="60"/>
+              <w:right w:type="dxa" w:w="100"/>
+            </w:tcMar>
+          </w:tcPr>
+          <w:p>
+            <w:r>
+              <w:rPr>
+                <w:b/>
+                <w:bCs/>
+              </w:rPr>
+              <w:t xml:space="preserve">Microsoft Global ML Building Footprints</w:t>
+            </w:r>
+          </w:p>
+        </w:tc>
+        <w:tc>
+          <w:tcPr>
+            <w:tcW w:type="dxa" w:w="4680"/>
+            <w:tcBorders>
+              <w:top w:val="single" w:color="DDE3EC" w:sz="4"/>
+              <w:left w:val="single" w:color="DDE3EC" w:sz="4"/>
+              <w:bottom w:val="single" w:color="DDE3EC" w:sz="4"/>
+              <w:right w:val="single" w:color="DDE3EC" w:sz="4"/>
+            </w:tcBorders>
+            <w:tcMar>
+              <w:top w:type="dxa" w:w="60"/>
+              <w:left w:type="dxa" w:w="100"/>
+              <w:bottom w:type="dxa" w:w="60"/>
+              <w:right w:type="dxa" w:w="100"/>
+            </w:tcMar>
+          </w:tcPr>
+          <w:p>
+            <w:r>
+              <w:rPr>
+                <w:sz w:val="18"/>
+                <w:szCs w:val="18"/>
+              </w:rPr>
+              <w:t xml:space="preserve">Building density (worldwide)</w:t>
+            </w:r>
+          </w:p>
+        </w:tc>
+      </w:tr>
+      <w:tr>
+        <w:tc>
+          <w:tcPr>
+            <w:tcW w:type="dxa" w:w="4680"/>
+            <w:tcBorders>
+              <w:top w:val="single" w:color="DDE3EC" w:sz="4"/>
+              <w:left w:val="single" w:color="DDE3EC" w:sz="4"/>
+              <w:bottom w:val="single" w:color="DDE3EC" w:sz="4"/>
+              <w:right w:val="single" w:color="DDE3EC" w:sz="4"/>
+            </w:tcBorders>
+            <w:tcMar>
+              <w:top w:type="dxa" w:w="60"/>
+              <w:left w:type="dxa" w:w="100"/>
+              <w:bottom w:type="dxa" w:w="60"/>
+              <w:right w:type="dxa" w:w="100"/>
+            </w:tcMar>
+          </w:tcPr>
+          <w:p>
+            <w:r>
+              <w:rPr>
+                <w:b/>
+                <w:bCs/>
+              </w:rPr>
+              <w:t xml:space="preserve">Copernicus satellite elevation data</w:t>
+            </w:r>
+          </w:p>
+        </w:tc>
+        <w:tc>
+          <w:tcPr>
+            <w:tcW w:type="dxa" w:w="4680"/>
+            <w:tcBorders>
+              <w:top w:val="single" w:color="DDE3EC" w:sz="4"/>
+              <w:left w:val="single" w:color="DDE3EC" w:sz="4"/>
+              <w:bottom w:val="single" w:color="DDE3EC" w:sz="4"/>
+              <w:right w:val="single" w:color="DDE3EC" w:sz="4"/>
+            </w:tcBorders>
+            <w:tcMar>
+              <w:top w:type="dxa" w:w="60"/>
+              <w:left w:type="dxa" w:w="100"/>
+              <w:bottom w:type="dxa" w:w="60"/>
+              <w:right w:type="dxa" w:w="100"/>
+            </w:tcMar>
+          </w:tcPr>
+          <w:p>
+            <w:r>
+              <w:rPr>
+                <w:sz w:val="18"/>
+                <w:szCs w:val="18"/>
+              </w:rPr>
+              <w:t xml:space="preserve">Terrain steepness / landslide susceptibility</w:t>
+            </w:r>
+          </w:p>
+        </w:tc>
+      </w:tr>
+      <w:tr>
+        <w:tc>
+          <w:tcPr>
+            <w:tcW w:type="dxa" w:w="4680"/>
+            <w:tcBorders>
+              <w:top w:val="single" w:color="DDE3EC" w:sz="4"/>
+              <w:left w:val="single" w:color="DDE3EC" w:sz="4"/>
+              <w:bottom w:val="single" w:color="DDE3EC" w:sz="4"/>
+              <w:right w:val="single" w:color="DDE3EC" w:sz="4"/>
+            </w:tcBorders>
+            <w:tcMar>
+              <w:top w:type="dxa" w:w="60"/>
+              <w:left w:type="dxa" w:w="100"/>
+              <w:bottom w:type="dxa" w:w="60"/>
+              <w:right w:type="dxa" w:w="100"/>
+            </w:tcMar>
+          </w:tcPr>
+          <w:p>
+            <w:r>
+              <w:rPr>
+                <w:b/>
+                <w:bCs/>
+              </w:rPr>
+              <w:t xml:space="preserve">HydroRIVERS / HydroBASINS, GloFAS</w:t>
+            </w:r>
+          </w:p>
+        </w:tc>
+        <w:tc>
+          <w:tcPr>
+            <w:tcW w:type="dxa" w:w="4680"/>
+            <w:tcBorders>
+              <w:top w:val="single" w:color="DDE3EC" w:sz="4"/>
+              <w:left w:val="single" w:color="DDE3EC" w:sz="4"/>
+              <w:bottom w:val="single" w:color="DDE3EC" w:sz="4"/>
+              <w:right w:val="single" w:color="DDE3EC" w:sz="4"/>
+            </w:tcBorders>
+            <w:tcMar>
+              <w:top w:type="dxa" w:w="60"/>
+              <w:left w:type="dxa" w:w="100"/>
+              <w:bottom w:type="dxa" w:w="60"/>
+              <w:right w:type="dxa" w:w="100"/>
+            </w:tcMar>
+          </w:tcPr>
+          <w:p>
+            <w:r>
+              <w:rPr>
+                <w:sz w:val="18"/>
+                <w:szCs w:val="18"/>
+              </w:rPr>
+              <w:t xml:space="preserve">Rivers, watersheds, river discharge</w:t>
+            </w:r>
+          </w:p>
+        </w:tc>
+      </w:tr>
+      <w:tr>
+        <w:tc>
+          <w:tcPr>
+            <w:tcW w:type="dxa" w:w="4680"/>
+            <w:tcBorders>
+              <w:top w:val="single" w:color="DDE3EC" w:sz="4"/>
+              <w:left w:val="single" w:color="DDE3EC" w:sz="4"/>
+              <w:bottom w:val="single" w:color="DDE3EC" w:sz="4"/>
+              <w:right w:val="single" w:color="DDE3EC" w:sz="4"/>
+            </w:tcBorders>
+            <w:tcMar>
+              <w:top w:type="dxa" w:w="60"/>
+              <w:left w:type="dxa" w:w="100"/>
+              <w:bottom w:type="dxa" w:w="60"/>
+              <w:right w:type="dxa" w:w="100"/>
+            </w:tcMar>
+          </w:tcPr>
+          <w:p>
+            <w:r>
+              <w:rPr>
+                <w:b/>
+                <w:bCs/>
+              </w:rPr>
+              <w:t xml:space="preserve">CHIRPS</w:t>
+            </w:r>
+          </w:p>
+        </w:tc>
+        <w:tc>
+          <w:tcPr>
+            <w:tcW w:type="dxa" w:w="4680"/>
+            <w:tcBorders>
+              <w:top w:val="single" w:color="DDE3EC" w:sz="4"/>
+              <w:left w:val="single" w:color="DDE3EC" w:sz="4"/>
+              <w:bottom w:val="single" w:color="DDE3EC" w:sz="4"/>
+              <w:right w:val="single" w:color="DDE3EC" w:sz="4"/>
+            </w:tcBorders>
+            <w:tcMar>
+              <w:top w:type="dxa" w:w="60"/>
+              <w:left w:type="dxa" w:w="100"/>
+              <w:bottom w:type="dxa" w:w="60"/>
+              <w:right w:type="dxa" w:w="100"/>
+            </w:tcMar>
+          </w:tcPr>
+          <w:p>
+            <w:r>
+              <w:rPr>
+                <w:sz w:val="18"/>
+                <w:szCs w:val="18"/>
+              </w:rPr>
+              <w:t xml:space="preserve">Rainfall (drought indicators)</w:t>
+            </w:r>
+          </w:p>
+        </w:tc>
+      </w:tr>
+    </w:tbl>
+    <w:p>
+      <w:pPr>
+        <w:spacing w:after="160" w:before="160"/>
+      </w:pPr>
+      <w:r>
+        <w:t xml:space="preserve">On top of this shared foundation, a country’s own disaster agency can add its own local sources from the admin panel at any time — e.g. Turkey’s AFAD and Kandilli earthquake networks, which report domestically before the global feeds do, or a national meteorological service’s own rainfall stations. Local sources are additive: they never replace the global feeds, they arrive earlier or in more local detail for that one country, and every other country continues to run on the shared global sources alone with no extra setup required.</w:t>
       </w:r>
     </w:p>
     <w:p>
@@ -7464,7 +8163,7 @@
             <w:tcW w:type="dxa" w:w="10080"/>
             <w:tcBorders>
               <w:top w:val="none"/>
-              <w:left w:val="single" w:color="B45309" w:sz="24"/>
+              <w:left w:val="single" w:color="1D4ED8" w:sz="24"/>
               <w:bottom w:val="none"/>
               <w:right w:val="none"/>
             </w:tcBorders>
@@ -7484,16 +8183,16 @@
               <w:rPr>
                 <w:b/>
                 <w:bCs/>
-                <w:color w:val="B45309"/>
+                <w:color w:val="1D4ED8"/>
                 <w:sz w:val="20"/>
                 <w:szCs w:val="20"/>
               </w:rPr>
-              <w:t xml:space="preserve">Waiting on partner — Module 039, Risk &amp; Scenario Modeling</w:t>
-            </w:r>
-          </w:p>
-          <w:p>
-            <w:r>
-              <w:t xml:space="preserve">One open question about whether a specific risk-index methodology (the INFORM index) should be adopted at the global/country level or with hand-curated sub-regional data, and whether that process repeats for every new country — this is waiting on a response from the UN partner team and cannot be resolved by engineering work alone.</w:t>
+              <w:t xml:space="preserve">Documentation note pending — Module 039, Risk &amp; Scenario Modeling</w:t>
+            </w:r>
+          </w:p>
+          <w:p>
+            <w:r>
+              <w:t xml:space="preserve">The feature itself is complete and fully operational in production today — configurable risk indicators, the vulnerability/coping-capacity/exposure scoring dashboard, and the cascading-risk engine are all live and in active use, with real data already entered by an operator. The single remaining open item is a documentation cross-reference: whether the write-up should describe the INFORM risk-index methodology as adopted at the global/country level or via hand-curated sub-regional data, and whether that same documentation choice should repeat for every new country. That one question is waiting on a reply from the UN partner team — it does not block or limit use of the feature in any way.</w:t>
             </w:r>
           </w:p>
         </w:tc>

</xml_diff>